<commit_message>
Integrate latest work into development document
</commit_message>
<xml_diff>
--- a/proposal/Dokumen Pengembangan AplikasiSISDMK Dinas Kesehatan Rev 1.docx
+++ b/proposal/Dokumen Pengembangan AplikasiSISDMK Dinas Kesehatan Rev 1.docx
@@ -2008,6 +2008,36 @@
                 <w:szCs w:val="24"/>
               </w:rPr>
               <w:t>, diagram, dan screenshot menu.</w:t>
+            </w:r>
+          </w:p>
+        </w:tc>
+      </w:tr>
+      <w:tr>
+        <w:tc>
+          <w:p>
+            <w:r>
+              <w:t>10 Mei 2026</w:t>
+            </w:r>
+          </w:p>
+        </w:tc>
+        <w:tc>
+          <w:p>
+            <w:r>
+              <w:t>1.1</w:t>
+            </w:r>
+          </w:p>
+        </w:tc>
+        <w:tc>
+          <w:p>
+            <w:r>
+              <w:t>Tim Pengembangan SISDMK</w:t>
+            </w:r>
+          </w:p>
+        </w:tc>
+        <w:tc>
+          <w:p>
+            <w:r>
+              <w:t>Penyempurnaan deployment CasaOS/DietPi, import data PLT/PLH PostgreSQL, dashboard analitik Wilayah/UKPD/Rumpun Jabatan, filter status dan wilayah, pembatasan akses Super Admin, tooltip nama pegawai pada chart, serta standardisasi tampilan chart.</w:t>
             </w:r>
           </w:p>
         </w:tc>
@@ -6564,6 +6594,11 @@
       <w:bookmarkEnd w:id="4"/>
       <w:bookmarkEnd w:id="5"/>
     </w:p>
+    <w:p>
+      <w:r>
+        <w:t>Versi 1.1 menambahkan penyempurnaan operasional deployment, integrasi data PLT/PLH, serta perluasan dashboard analitik. Pekerjaan ini melanjutkan rancangan sebelumnya agar aplikasi tidak hanya lengkap secara fungsi, tetapi juga siap dijalankan berulang di lingkungan CasaOS/DietPi dengan Docker dan reverse proxy domain produksi.</w:t>
+      </w:r>
+    </w:p>
     <w:p ns2:paraId="1F303C43" ns2:textId="77777777">
       <w:pPr>
         <w:ind w:firstLine="720"/>
@@ -16117,6 +16152,54 @@
           </w:p>
         </w:tc>
       </w:tr>
+      <w:tr>
+        <w:tc>
+          <w:p>
+            <w:r>
+              <w:t>CasaOS</w:t>
+            </w:r>
+          </w:p>
+        </w:tc>
+        <w:tc>
+          <w:p>
+            <w:r>
+              <w:t>Platform manajemen aplikasi berbasis Docker yang digunakan pada server DietPi untuk menjalankan container SISDMK dan reverse proxy.</w:t>
+            </w:r>
+          </w:p>
+        </w:tc>
+      </w:tr>
+      <w:tr>
+        <w:tc>
+          <w:p>
+            <w:r>
+              <w:t>PWA</w:t>
+            </w:r>
+          </w:p>
+        </w:tc>
+        <w:tc>
+          <w:p>
+            <w:r>
+              <w:t>Progressive Web App, yaitu mekanisme instalasi dan cache aplikasi melalui manifest dan service worker pada domain HTTPS.</w:t>
+            </w:r>
+          </w:p>
+        </w:tc>
+      </w:tr>
+      <w:tr>
+        <w:tc>
+          <w:p>
+            <w:r>
+              <w:t>PLT/PLH</w:t>
+            </w:r>
+          </w:p>
+        </w:tc>
+        <w:tc>
+          <w:p>
+            <w:r>
+              <w:t>Pejabat Pelaksana Tugas/Pelaksana Harian yang datanya diimpor ke PostgreSQL untuk mendukung referensi pejabat pada aplikasi.</w:t>
+            </w:r>
+          </w:p>
+        </w:tc>
+      </w:tr>
     </w:tbl>
     <w:p ns2:paraId="6CB88B39" ns2:textId="77777777">
       <w:pPr>
@@ -16657,6 +16740,16 @@
       <w:bookmarkEnd w:id="21"/>
       <w:bookmarkEnd w:id="22"/>
       <w:proofErr w:type="spellEnd"/>
+    </w:p>
+    <w:p>
+      <w:r>
+        <w:t>Penyempurnaan antarmuka dashboard dilakukan dengan menempatkan analisis Wilayah, UKPD, Pangkat, Rumpun Jabatan, Masa Kerja, Umur, Pendidikan, dan Pensiun pada tab horizontal. Setiap chart menggunakan ukuran kartu yang distandarkan, memiliki tombol unduh PNG, serta tooltip yang dapat menampilkan daftar nama pegawai pada kategori yang dipilih.</w:t>
+      </w:r>
+    </w:p>
+    <w:p>
+      <w:r>
+        <w:t>Filter Status Pegawai berlaku untuk seluruh chart dashboard, sedangkan Filter Wilayah disediakan untuk Super Admin agar analisis lintas organisasi dapat dipersempit tanpa mengubah scope keamanan role pengguna lain.</w:t>
+      </w:r>
     </w:p>
     <w:p ns2:paraId="75888D60" ns2:textId="77777777">
       <w:pPr>
@@ -20476,6 +20569,66 @@
           </w:p>
         </w:tc>
       </w:tr>
+      <w:tr>
+        <w:tc>
+          <w:p>
+            <w:r>
+              <w:t>Dashboard Analitik Organisasi</w:t>
+            </w:r>
+          </w:p>
+        </w:tc>
+        <w:tc>
+          <w:p>
+            <w:r>
+              <w:t>/dashboard</w:t>
+            </w:r>
+          </w:p>
+        </w:tc>
+        <w:tc>
+          <w:p>
+            <w:r>
+              <w:t>SUPER_ADMIN</w:t>
+            </w:r>
+          </w:p>
+        </w:tc>
+        <w:tc>
+          <w:p>
+            <w:r>
+              <w:t>Menampilkan analisis pegawai berdasarkan Wilayah dan UKPD, termasuk komposisi status pegawai per organisasi serta grafik jenis kelamin per wilayah.</w:t>
+            </w:r>
+          </w:p>
+        </w:tc>
+      </w:tr>
+      <w:tr>
+        <w:tc>
+          <w:p>
+            <w:r>
+              <w:t>Dashboard Rumpun Jabatan</w:t>
+            </w:r>
+          </w:p>
+        </w:tc>
+        <w:tc>
+          <w:p>
+            <w:r>
+              <w:t>/dashboard</w:t>
+            </w:r>
+          </w:p>
+        </w:tc>
+        <w:tc>
+          <w:p>
+            <w:r>
+              <w:t>SUPER_ADMIN, ADMIN_WILAYAH, ADMIN_UKPD</w:t>
+            </w:r>
+          </w:p>
+        </w:tc>
+        <w:tc>
+          <w:p>
+            <w:r>
+              <w:t>Menampilkan distribusi pegawai berdasarkan rumpun jabatan, total pegawai, dan perbandingan jenis kelamin sesuai cakupan akses pengguna.</w:t>
+            </w:r>
+          </w:p>
+        </w:tc>
+      </w:tr>
     </w:tbl>
     <w:p ns2:paraId="10D119FE" ns2:textId="7167C7D6">
       <w:pPr>
@@ -23184,6 +23337,29 @@
           </w:p>
         </w:tc>
       </w:tr>
+      <w:tr>
+        <w:tc>
+          <w:p>
+            <w:r>
+              <w:t>Dashboard analitik</w:t>
+            </w:r>
+          </w:p>
+        </w:tc>
+        <w:tc>
+          <w:p>
+            <w:r>
+              <w:t>Filter status pegawai, filter wilayah, tab Wilayah/UKPD/Rumpun Jabatan</w:t>
+            </w:r>
+          </w:p>
+        </w:tc>
+        <w:tc>
+          <w:p>
+            <w:r>
+              <w:t>Filter wilayah hanya ditampilkan untuk Super Admin; status pegawai memengaruhi seluruh chart; data tetap mengikuti scope role pengguna.</w:t>
+            </w:r>
+          </w:p>
+        </w:tc>
+      </w:tr>
     </w:tbl>
     <w:p ns2:paraId="3AF3B6D8" ns2:textId="77777777">
       <w:pPr>
@@ -25147,6 +25323,52 @@
                 <w:szCs w:val="24"/>
               </w:rPr>
               <w:t xml:space="preserve"> di UI.</w:t>
+            </w:r>
+          </w:p>
+        </w:tc>
+      </w:tr>
+      <w:tr>
+        <w:tc>
+          <w:p>
+            <w:r>
+              <w:t>Filter Dashboard</w:t>
+            </w:r>
+          </w:p>
+        </w:tc>
+        <w:tc>
+          <w:p>
+            <w:r>
+              <w:t>Change dropdown status/wilayah</w:t>
+            </w:r>
+          </w:p>
+        </w:tc>
+        <w:tc>
+          <w:p>
+            <w:r>
+              <w:t>Memuat ulang agregasi chart sesuai kombinasi filter aktif tanpa menggandakan menu atau mengubah cakupan hak akses.</w:t>
+            </w:r>
+          </w:p>
+        </w:tc>
+      </w:tr>
+      <w:tr>
+        <w:tc>
+          <w:p>
+            <w:r>
+              <w:t>Unduh PNG Chart</w:t>
+            </w:r>
+          </w:p>
+        </w:tc>
+        <w:tc>
+          <w:p>
+            <w:r>
+              <w:t>Button pada kartu chart</w:t>
+            </w:r>
+          </w:p>
+        </w:tc>
+        <w:tc>
+          <w:p>
+            <w:r>
+              <w:t>Mengunduh visual chart aktif untuk kebutuhan laporan, presentasi, atau dokumentasi.</w:t>
             </w:r>
           </w:p>
         </w:tc>
@@ -28139,6 +28361,54 @@
                 <w:szCs w:val="24"/>
               </w:rPr>
               <w:t>.</w:t>
+            </w:r>
+          </w:p>
+        </w:tc>
+      </w:tr>
+      <w:tr>
+        <w:tc>
+          <w:p>
+            <w:r>
+              <w:t>Dashboard analitik wilayah/UKPD</w:t>
+            </w:r>
+          </w:p>
+        </w:tc>
+        <w:tc>
+          <w:p>
+            <w:r>
+              <w:t>Sistem mengambil data pegawai aktif, menerapkan filter status dan wilayah, mengagregasi per UKPD/wilayah/rumpun jabatan, lalu menampilkan chart bar bertumpuk, chart jenis kelamin, serta tooltip nama pegawai.</w:t>
+            </w:r>
+          </w:p>
+        </w:tc>
+      </w:tr>
+      <w:tr>
+        <w:tc>
+          <w:p>
+            <w:r>
+              <w:t>Import data PLT/PLH</w:t>
+            </w:r>
+          </w:p>
+        </w:tc>
+        <w:tc>
+          <w:p>
+            <w:r>
+              <w:t>Operator menyiapkan file SQL hasil export PostgreSQL lokal, menjalankan script import ke database si_data pada server, lalu memvalidasi isi tabel pejabat PLT/PLH melalui query dan tampilan aplikasi.</w:t>
+            </w:r>
+          </w:p>
+        </w:tc>
+      </w:tr>
+      <w:tr>
+        <w:tc>
+          <w:p>
+            <w:r>
+              <w:t>Redeploy CasaOS/Docker</w:t>
+            </w:r>
+          </w:p>
+        </w:tc>
+        <w:tc>
+          <w:p>
+            <w:r>
+              <w:t>Operator menjalankan script redeploy; sistem melakukan fetch/pull branch deploy, build image terbaru, menghentikan container lama, menjalankan container baru pada 0.0.0.0:8091-&gt;3000/tcp, lalu melakukan health check host dan jaringan CasaOS.</w:t>
             </w:r>
           </w:p>
         </w:tc>
@@ -36728,6 +36998,43 @@
           </w:p>
         </w:tc>
       </w:tr>
+      <w:tr>
+        <w:tc>
+          <w:p>
+            <w:r>
+              <w:t>pejabat_plt_plh</w:t>
+            </w:r>
+          </w:p>
+        </w:tc>
+        <w:tc>
+          <w:p>
+            <w:r>
+              <w:t>Referensi/transaksi</w:t>
+            </w:r>
+          </w:p>
+        </w:tc>
+        <w:tc>
+          <w:p>
+            <w:r>
+              <w:t>id</w:t>
+            </w:r>
+          </w:p>
+        </w:tc>
+        <w:tc>
+          <w:p>
+            <w:r>
+              <w:t>jenis_penugasan, id_pegawai, nama_pejabat, jabatan_saat_ini, ukpd, tanggal_mulai, tanggal_selesai</w:t>
+            </w:r>
+          </w:p>
+        </w:tc>
+        <w:tc>
+          <w:p>
+            <w:r>
+              <w:t>Menyimpan data PLT/PLH hasil import PostgreSQL untuk referensi pejabat dan kebutuhan pelaporan.</w:t>
+            </w:r>
+          </w:p>
+        </w:tc>
+      </w:tr>
     </w:tbl>
     <w:p ns2:paraId="1610184B" ns2:textId="1EE92652">
       <w:pPr>
@@ -38336,6 +38643,66 @@
           </w:p>
         </w:tc>
       </w:tr>
+      <w:tr>
+        <w:tc>
+          <w:p>
+            <w:r>
+              <w:t>Dashboard wilayah dan UKPD</w:t>
+            </w:r>
+          </w:p>
+        </w:tc>
+        <w:tc>
+          <w:p>
+            <w:r>
+              <w:t>pegawai, ukpd</w:t>
+            </w:r>
+          </w:p>
+        </w:tc>
+        <w:tc>
+          <w:p>
+            <w:r>
+              <w:t>wilayah, nama_ukpd, status pegawai, jenis kelamin, total per kategori</w:t>
+            </w:r>
+          </w:p>
+        </w:tc>
+        <w:tc>
+          <w:p>
+            <w:r>
+              <w:t>Menampilkan persebaran pegawai aktif per wilayah dan UKPD dengan chart bertumpuk berdasarkan status pegawai.</w:t>
+            </w:r>
+          </w:p>
+        </w:tc>
+      </w:tr>
+      <w:tr>
+        <w:tc>
+          <w:p>
+            <w:r>
+              <w:t>Dashboard rumpun jabatan</w:t>
+            </w:r>
+          </w:p>
+        </w:tc>
+        <w:tc>
+          <w:p>
+            <w:r>
+              <w:t>pegawai</w:t>
+            </w:r>
+          </w:p>
+        </w:tc>
+        <w:tc>
+          <w:p>
+            <w:r>
+              <w:t>status_rumpun, jenis kelamin, jenis pegawai, total pegawai</w:t>
+            </w:r>
+          </w:p>
+        </w:tc>
+        <w:tc>
+          <w:p>
+            <w:r>
+              <w:t>Menampilkan distribusi pegawai berdasarkan rumpun jabatan dan komposisi jenis kelamin.</w:t>
+            </w:r>
+          </w:p>
+        </w:tc>
+      </w:tr>
     </w:tbl>
     <w:p ns2:paraId="36468B88" ns2:textId="77777777">
       <w:pPr>
@@ -40508,6 +40875,52 @@
           </w:p>
         </w:tc>
       </w:tr>
+      <w:tr>
+        <w:tc>
+          <w:p>
+            <w:r>
+              <w:t>pejabat_plt_plh</w:t>
+            </w:r>
+          </w:p>
+        </w:tc>
+        <w:tc>
+          <w:p>
+            <w:r>
+              <w:t>Penambahan/penyesuaian data import PLT/PLH dari PostgreSQL lokal ke server online.</w:t>
+            </w:r>
+          </w:p>
+        </w:tc>
+        <w:tc>
+          <w:p>
+            <w:r>
+              <w:t>Mendukung migrasi data pejabat PLT/PLH agar tersedia pada database produksi SISDMK.</w:t>
+            </w:r>
+          </w:p>
+        </w:tc>
+      </w:tr>
+      <w:tr>
+        <w:tc>
+          <w:p>
+            <w:r>
+              <w:t>dashboard agregasi</w:t>
+            </w:r>
+          </w:p>
+        </w:tc>
+        <w:tc>
+          <w:p>
+            <w:r>
+              <w:t>Penambahan agregasi wilayah, UKPD, rumpun jabatan, filter status pegawai, filter wilayah, dan daftar nama pegawai pada tooltip chart.</w:t>
+            </w:r>
+          </w:p>
+        </w:tc>
+        <w:tc>
+          <w:p>
+            <w:r>
+              <w:t>Meningkatkan ketajaman analisis pegawai dan membantu pimpinan menelusuri data dari chart ke pegawai terkait.</w:t>
+            </w:r>
+          </w:p>
+        </w:tc>
+      </w:tr>
     </w:tbl>
     <w:p ns2:paraId="121708D7" ns2:textId="77777777">
       <w:pPr>
@@ -40545,6 +40958,16 @@
       <w:bookmarkEnd w:id="54"/>
       <w:bookmarkEnd w:id="55"/>
       <w:proofErr w:type="spellEnd"/>
+    </w:p>
+    <w:p>
+      <w:r>
+        <w:t>Pada fase penyempurnaan operasional, integrasi aplikasi diperluas ke standar deployment CasaOS/DietPi. Proses redeploy menggunakan script produksi yang membangun image terbaru, membersihkan container lama, menjalankan container baru pada port publik 8091, dan memvalidasi akses melalui host serta IP jaringan CasaOS.</w:t>
+      </w:r>
+    </w:p>
+    <w:p>
+      <w:r>
+        <w:t>Integrasi PostgreSQL tetap menggunakan database eksternal melalui environment file server. Data PLT/PLH yang berasal dari PostgreSQL lokal dapat diimpor ke database si_data pada server online melalui script import, kemudian divalidasi melalui query database dan tampilan aplikasi.</w:t>
+      </w:r>
     </w:p>
     <w:p ns2:paraId="5E93F396" ns2:textId="77777777">
       <w:pPr>
@@ -42191,6 +42614,54 @@
           </w:p>
         </w:tc>
       </w:tr>
+      <w:tr>
+        <w:tc>
+          <w:p>
+            <w:r>
+              <w:t>CasaOS/DietPi Docker runtime</w:t>
+            </w:r>
+          </w:p>
+        </w:tc>
+        <w:tc>
+          <w:p>
+            <w:r>
+              <w:t>Aplikasi dijalankan sebagai container sisdmk2-app dengan image sisdmk2-app:latest, membaca --env-file /DATA/AppData/si-kepegawaian/.env, dan publish port 0.0.0.0:8091-&gt;3000/tcp.</w:t>
+            </w:r>
+          </w:p>
+        </w:tc>
+      </w:tr>
+      <w:tr>
+        <w:tc>
+          <w:p>
+            <w:r>
+              <w:t>Reverse proxy CasaOS</w:t>
+            </w:r>
+          </w:p>
+        </w:tc>
+        <w:tc>
+          <w:p>
+            <w:r>
+              <w:t>Domain https://dinkes.kepegawaian.media diarahkan ke http://172.31.254.202:8091; script redeploy memvalidasi akses melalui curl host 127.0.0.1:8091 dan IP CasaOS 172.31.254.202:8091.</w:t>
+            </w:r>
+          </w:p>
+        </w:tc>
+      </w:tr>
+      <w:tr>
+        <w:tc>
+          <w:p>
+            <w:r>
+              <w:t>PostgreSQL eksternal</w:t>
+            </w:r>
+          </w:p>
+        </w:tc>
+        <w:tc>
+          <w:p>
+            <w:r>
+              <w:t>Koneksi database menggunakan konfigurasi POSTGRES_* pada file .env; import PLT/PLH diarahkan ke database si_data tanpa memasukkan kredensial ke image Docker.</w:t>
+            </w:r>
+          </w:p>
+        </w:tc>
+      </w:tr>
     </w:tbl>
     <w:p ns2:paraId="5A219A41" ns2:textId="77777777">
       <w:pPr>
@@ -43364,6 +43835,11 @@
       <w:bookmarkEnd w:id="66"/>
       <w:bookmarkEnd w:id="67"/>
     </w:p>
+    <w:p>
+      <w:r>
+        <w:t>Dashboard versi terbaru menambahkan filter Status Pegawai dan Wilayah, tab analitik Berdasarkan Wilayah, Berdasarkan UKPD, dan Berdasarkan Rumpun Jabatan. Tab Wilayah dan UKPD hanya tampil untuk Super Admin karena memuat agregasi lintas organisasi, sedangkan tab analitik lain tetap mengikuti hak akses pengguna.</w:t>
+      </w:r>
+    </w:p>
     <w:p ns2:paraId="42366B7B" ns2:textId="77777777">
       <w:pPr>
         <w:rPr>
@@ -53455,270 +53931,6 @@
     <w:p>
       <w:r>
         <w:br w:type="page"/>
-      </w:r>
-    </w:p>
-    <w:p>
-      <w:pPr>
-        <w:pStyle w:val="Heading1"/>
-      </w:pPr>
-      <w:r>
-        <w:rPr>
-          <w:b/>
-        </w:rPr>
-        <w:t>PEMBARUAN PEKERJAAN PENGEMBANGAN - 10 MEI 2026</w:t>
-      </w:r>
-    </w:p>
-    <w:p>
-      <w:r>
-        <w:t>Bagian ini melengkapi dokumen pengembangan dengan pekerjaan tambahan yang telah dilakukan pada fase penyempurnaan operasional, integrasi data, dan dashboard analitik SISDMK.</w:t>
-      </w:r>
-    </w:p>
-    <w:p>
-      <w:pPr>
-        <w:pStyle w:val="Heading2"/>
-      </w:pPr>
-      <w:r>
-        <w:rPr>
-          <w:b/>
-        </w:rPr>
-        <w:t>1. Standarisasi Deployment CasaOS/DietPi</w:t>
-      </w:r>
-    </w:p>
-    <w:p>
-      <w:r>
-        <w:t>- Menambahkan script scripts/redeploy-casaos.sh untuk proses redeploy aplikasi Next.js berbasis Docker tanpa docker compose.</w:t>
-      </w:r>
-    </w:p>
-    <w:p>
-      <w:r>
-        <w:t>- Alur redeploy dibuat repeatable: git fetch, checkout branch pgadmin4-drh-nrk-fix, git pull, docker build, stop container lama, remove container lama, run container baru, lalu health check otomatis.</w:t>
-      </w:r>
-    </w:p>
-    <w:p>
-      <w:r>
-        <w:t>- Port publik distandarkan ke 0.0.0.0:8091-&gt;3000/tcp agar kompatibel dengan reverse proxy CasaOS dan tidak bind ke localhost 127.0.0.1.</w:t>
-      </w:r>
-    </w:p>
-    <w:p>
-      <w:r>
-        <w:t>- Script tetap memakai --env-file /DATA/AppData/si-kepegawaian/.env sehingga konfigurasi PostgreSQL eksternal tidak berpindah ke image.</w:t>
-      </w:r>
-    </w:p>
-    <w:p>
-      <w:r>
-        <w:t>- Jika redeploy gagal, script menampilkan docker logs, docker ps, docker images, dan ss -tulpn untuk membantu menemukan konflik port atau container bermasalah.</w:t>
-      </w:r>
-    </w:p>
-    <w:p>
-      <w:pPr>
-        <w:pStyle w:val="Heading2"/>
-      </w:pPr>
-      <w:r>
-        <w:rPr>
-          <w:b/>
-        </w:rPr>
-        <w:t>2. Migrasi dan Import Data PLT/PLH PostgreSQL</w:t>
-      </w:r>
-    </w:p>
-    <w:p>
-      <w:r>
-        <w:t>- Menambahkan script scripts/import-plt-server.sh sebagai panduan operasional import data pejabat PLT/PLH dari SQL ke database PostgreSQL server.</w:t>
-      </w:r>
-    </w:p>
-    <w:p>
-      <w:r>
-        <w:t>- Proses import diarahkan ke database si_data dengan user aplikasi sesuai .env, sehingga data PLT/PLH dapat dipindahkan dari server lokal ke server CasaOS/online.</w:t>
-      </w:r>
-    </w:p>
-    <w:p>
-      <w:r>
-        <w:t>- Dokumentasi operasional mencakup pemeriksaan koneksi database, pengecekan tabel target, dan validasi setelah import.</w:t>
-      </w:r>
-    </w:p>
-    <w:p>
-      <w:pPr>
-        <w:pStyle w:val="Heading2"/>
-      </w:pPr>
-      <w:r>
-        <w:rPr>
-          <w:b/>
-        </w:rPr>
-        <w:t>3. Pengembangan Dashboard Analitik Kepegawaian</w:t>
-      </w:r>
-    </w:p>
-    <w:p>
-      <w:r>
-        <w:t>- Menambahkan tab analitik Berdasarkan Wilayah dan Berdasarkan UKPD pada dashboard utama untuk melihat persebaran pegawai aktif berdasarkan organisasi.</w:t>
-      </w:r>
-    </w:p>
-    <w:p>
-      <w:r>
-        <w:t>- Menambahkan tab Berdasarkan Rumpun Jabatan agar dashboard dapat menampilkan distribusi pegawai menurut rumpun jabatan dan jenis kelamin.</w:t>
-      </w:r>
-    </w:p>
-    <w:p>
-      <w:r>
-        <w:t>- Chart UKPD dan Wilayah dibuat dalam bentuk batang bertumpuk berdasarkan status pegawai, sehingga komposisi PNS, CPNS, PPPK, Profesional, PJLP, dan PPPK Paruh Waktu dapat terlihat dalam satu grafik.</w:t>
-      </w:r>
-    </w:p>
-    <w:p>
-      <w:r>
-        <w:t>- Chart jenis kelamin tetap disediakan pada tab wilayah agar distribusi laki-laki dan perempuan dapat dibandingkan dengan total wilayah.</w:t>
-      </w:r>
-    </w:p>
-    <w:p>
-      <w:r>
-        <w:t>- Tooltip chart diperluas agar menampilkan nama pegawai pada titik/bar yang dipilih, sehingga hasil sortir atau drill pada grafik dapat ditelusuri ke pegawai terkait.</w:t>
-      </w:r>
-    </w:p>
-    <w:p>
-      <w:pPr>
-        <w:pStyle w:val="Heading2"/>
-      </w:pPr>
-      <w:r>
-        <w:rPr>
-          <w:b/>
-        </w:rPr>
-        <w:t>4. Filter dan Hak Akses Dashboard</w:t>
-      </w:r>
-    </w:p>
-    <w:p>
-      <w:r>
-        <w:t>- Menambahkan filter Status Pegawai pada dashboard menu chart sehingga seluruh tab dapat difilter berdasarkan Total Pegawai, PNS, CPNS, PPPK, Profesional, PJLP, dan PPPK Paruh Waktu.</w:t>
-      </w:r>
-    </w:p>
-    <w:p>
-      <w:r>
-        <w:t>- Menambahkan filter Wilayah pada seluruh chart dashboard untuk Super Admin, sehingga analisis pangkat, masa kerja, umur, pendidikan, pensiun, rumpun jabatan, UKPD, dan wilayah dapat dibatasi per wilayah.</w:t>
-      </w:r>
-    </w:p>
-    <w:p>
-      <w:r>
-        <w:t>- Tab Berdasarkan Wilayah dan Berdasarkan UKPD dibatasi khusus untuk Super Admin karena memuat data lintas organisasi.</w:t>
-      </w:r>
-    </w:p>
-    <w:p>
-      <w:r>
-        <w:t>- Role selain Super Admin tetap mengikuti cakupan data yang sudah ditentukan oleh sistem, sehingga akses data tidak melebar dari unit kerjanya.</w:t>
-      </w:r>
-    </w:p>
-    <w:p>
-      <w:pPr>
-        <w:pStyle w:val="Heading2"/>
-      </w:pPr>
-      <w:r>
-        <w:rPr>
-          <w:b/>
-        </w:rPr>
-        <w:t>5. Penyempurnaan Navigasi dan Tampilan</w:t>
-      </w:r>
-    </w:p>
-    <w:p>
-      <w:r>
-        <w:t>- Menghapus tombol Tambah Data Pegawai dari bagian bawah sidebar agar navigasi lebih bersih dan alur tambah pegawai tidak muncul sebagai CTA permanen.</w:t>
-      </w:r>
-    </w:p>
-    <w:p>
-      <w:r>
-        <w:t>- Tab Wilayah, UKPD, Pangkat, Rumpun Jabatan, Masa Kerja, Umur, Pendidikan, dan Pensiun disusun sebagai navigasi horizontal dashboard agar pengguna dapat berpindah analisis tanpa turun ke bagian bawah halaman.</w:t>
-      </w:r>
-    </w:p>
-    <w:p>
-      <w:r>
-        <w:t>- Ukuran kartu dan area chart distandarkan agar tinggi dan lebar grafik lebih seimbang di seluruh tab dashboard.</w:t>
-      </w:r>
-    </w:p>
-    <w:p>
-      <w:r>
-        <w:t>- Area header, grafik, dan ringkasan legend pada kartu chart dikunci secara konsisten sehingga perbedaan jumlah label tidak membuat tinggi kartu meloncat.</w:t>
-      </w:r>
-    </w:p>
-    <w:p>
-      <w:pPr>
-        <w:pStyle w:val="Heading2"/>
-      </w:pPr>
-      <w:r>
-        <w:rPr>
-          <w:b/>
-        </w:rPr>
-        <w:t>6. Validasi Operasional Setelah Deploy</w:t>
-      </w:r>
-    </w:p>
-    <w:p>
-      <w:r>
-        <w:t>- Aplikasi divalidasi melalui curl -I http://127.0.0.1:8091 dan curl -I http://172.31.254.202:8091 untuk memastikan container dapat diakses dari host dan jaringan CasaOS.</w:t>
-      </w:r>
-    </w:p>
-    <w:p>
-      <w:r>
-        <w:t>- Reverse proxy CasaOS diarahkan ke http://172.31.254.202:8091 agar domain https://dinkes.kepegawaian.media tidak menghasilkan 502 saat container aktif.</w:t>
-      </w:r>
-    </w:p>
-    <w:p>
-      <w:r>
-        <w:t>- PWA tetap bergantung pada domain HTTPS, service worker, manifest, dan asset statis Next.js; setelah redeploy pengguna dapat melakukan refresh hard atau reinstall PWA bila cache lama masih tersimpan.</w:t>
-      </w:r>
-    </w:p>
-    <w:p>
-      <w:pPr>
-        <w:pStyle w:val="Heading2"/>
-      </w:pPr>
-      <w:r>
-        <w:rPr>
-          <w:b/>
-        </w:rPr>
-        <w:t>Artefak Pekerjaan yang Ditambahkan/Diperbarui</w:t>
-      </w:r>
-    </w:p>
-    <w:p>
-      <w:r>
-        <w:t>- scripts/redeploy-casaos.sh - script redeploy produksi Docker untuk CasaOS/DietPi.</w:t>
-      </w:r>
-    </w:p>
-    <w:p>
-      <w:r>
-        <w:t>- scripts/import-plt-server.sh - script/panduan import data PLT/PLH ke PostgreSQL server.</w:t>
-      </w:r>
-    </w:p>
-    <w:p>
-      <w:r>
-        <w:t>- src/app/api/dashboard/route.js - penambahan agregasi chart wilayah, UKPD, rumpun jabatan, filter status, filter wilayah, dan payload dashboard.</w:t>
-      </w:r>
-    </w:p>
-    <w:p>
-      <w:r>
-        <w:t>- src/app/(app)/dashboard/page.jsx - penambahan tab dashboard, dropdown filter, cache chart per filter, dan pengaturan tampilan.</w:t>
-      </w:r>
-    </w:p>
-    <w:p>
-      <w:r>
-        <w:t>- src/components/charts/DashboardChartCard.jsx - standarisasi ukuran kartu chart, area grafik, tooltip nama pegawai, dan ringkasan legend.</w:t>
-      </w:r>
-    </w:p>
-    <w:p>
-      <w:pPr>
-        <w:pStyle w:val="Heading2"/>
-      </w:pPr>
-      <w:r>
-        <w:rPr>
-          <w:b/>
-        </w:rPr>
-        <w:t>Dampak terhadap Pengguna</w:t>
-      </w:r>
-    </w:p>
-    <w:p>
-      <w:r>
-        <w:t>- Super Admin dapat melihat analitik lintas wilayah dan lintas UKPD secara lebih lengkap.</w:t>
-      </w:r>
-    </w:p>
-    <w:p>
-      <w:r>
-        <w:t>- Pengguna dapat mengetahui komposisi pegawai per status, jenis kelamin, rumpun jabatan, masa kerja, umur, pendidikan, dan proyeksi pensiun dari dashboard yang sama.</w:t>
-      </w:r>
-    </w:p>
-    <w:p>
-      <w:r>
-        <w:t>- Tim operasional memiliki proses deploy dan troubleshooting yang lebih terukur, sehingga risiko container ganda, konflik port, dan 502 pada domain dapat dikurangi.</w:t>
       </w:r>
     </w:p>
     <w:sectPr>

</xml_diff>